<commit_message>
court(ttab) answer: typst/latex/docx on the shared cross-engine layout model; XENG-001..003 pass on latex and docx, params.cross_engine: gate (fb-595.54.6)
</commit_message>
<xml_diff>
--- a/courts/federal-circuit/trademark-trial-and-appeal-board/answer/docx/reference.docx
+++ b/courts/federal-circuit/trademark-trial-and-appeal-board/answer/docx/reference.docx
@@ -1,19 +1,322 @@
 
 <file path=word/document.xml><?xml version="1.0" encoding="utf-8"?>
-<w:document xmlns:w="http://schemas.openxmlformats.org/wordprocessingml/2006/main" xmlns:r="http://schemas.openxmlformats.org/officeDocument/2006/relationships">
+<w:document xmlns:w="http://schemas.openxmlformats.org/wordprocessingml/2006/main" xmlns:m="http://schemas.openxmlformats.org/officeDocument/2006/math" xmlns:r="http://schemas.openxmlformats.org/officeDocument/2006/relationships" xmlns:o="urn:schemas-microsoft-com:office:office" xmlns:v="urn:schemas-microsoft-com:vml" xmlns:w10="urn:schemas-microsoft-com:office:word" xmlns:a="http://schemas.openxmlformats.org/drawingml/2006/main" xmlns:pic="http://schemas.openxmlformats.org/drawingml/2006/picture" xmlns:wp="http://schemas.openxmlformats.org/drawingml/2006/wordprocessingDrawing">
   <w:body>
     <w:p>
       <w:pPr>
+        <w:pStyle w:val="Title"/>
+      </w:pPr>
+      <w:r>
+        <w:t xml:space="preserve">Title</w:t>
+      </w:r>
+    </w:p>
+    <w:p>
+      <w:pPr>
+        <w:pStyle w:val="Subtitle"/>
+      </w:pPr>
+      <w:r>
+        <w:t xml:space="preserve">Subtitle</w:t>
+      </w:r>
+    </w:p>
+    <w:p>
+      <w:pPr>
+        <w:pStyle w:val="Author"/>
+      </w:pPr>
+      <w:r>
+        <w:t xml:space="preserve">Author</w:t>
+      </w:r>
+    </w:p>
+    <w:p>
+      <w:pPr>
+        <w:pStyle w:val="Date"/>
+      </w:pPr>
+      <w:r>
+        <w:t xml:space="preserve">Date</w:t>
+      </w:r>
+    </w:p>
+    <w:p>
+      <w:pPr>
+        <w:pStyle w:val="Abstract"/>
+      </w:pPr>
+      <w:r>
+        <w:t xml:space="preserve">Abstract</w:t>
+      </w:r>
+    </w:p>
+    <w:p>
+      <w:pPr>
+        <w:pStyle w:val="Heading1"/>
+      </w:pPr>
+      <w:bookmarkStart w:id="21" w:name="heading-1"/>
+      <w:r>
+        <w:t xml:space="preserve">Heading 1</w:t>
+      </w:r>
+      <w:bookmarkEnd w:id="21"/>
+    </w:p>
+    <w:p>
+      <w:pPr>
+        <w:pStyle w:val="Heading2"/>
+      </w:pPr>
+      <w:bookmarkStart w:id="22" w:name="heading-2"/>
+      <w:r>
+        <w:t xml:space="preserve">Heading 2</w:t>
+      </w:r>
+      <w:bookmarkEnd w:id="22"/>
+    </w:p>
+    <w:p>
+      <w:pPr>
+        <w:pStyle w:val="Heading3"/>
+      </w:pPr>
+      <w:bookmarkStart w:id="23" w:name="heading-3"/>
+      <w:r>
+        <w:t xml:space="preserve">Heading 3</w:t>
+      </w:r>
+      <w:bookmarkEnd w:id="23"/>
+    </w:p>
+    <w:p>
+      <w:pPr>
+        <w:pStyle w:val="Heading4"/>
+      </w:pPr>
+      <w:bookmarkStart w:id="24" w:name="heading-4"/>
+      <w:r>
+        <w:t xml:space="preserve">Heading 4</w:t>
+      </w:r>
+      <w:bookmarkEnd w:id="24"/>
+    </w:p>
+    <w:p>
+      <w:pPr>
+        <w:pStyle w:val="Heading5"/>
+      </w:pPr>
+      <w:bookmarkStart w:id="25" w:name="heading-5"/>
+      <w:r>
+        <w:t xml:space="preserve">Heading 5</w:t>
+      </w:r>
+      <w:bookmarkEnd w:id="25"/>
+    </w:p>
+    <w:p>
+      <w:pPr>
+        <w:pStyle w:val="Heading6"/>
+      </w:pPr>
+      <w:bookmarkStart w:id="26" w:name="heading-6"/>
+      <w:r>
+        <w:t xml:space="preserve">Heading 6</w:t>
+      </w:r>
+      <w:bookmarkEnd w:id="26"/>
+    </w:p>
+    <w:p>
+      <w:pPr>
+        <w:pStyle w:val="Heading7"/>
+      </w:pPr>
+      <w:bookmarkStart w:id="27" w:name="heading-7"/>
+      <w:r>
+        <w:t xml:space="preserve">Heading 7</w:t>
+      </w:r>
+      <w:bookmarkEnd w:id="27"/>
+    </w:p>
+    <w:p>
+      <w:pPr>
+        <w:pStyle w:val="Heading8"/>
+      </w:pPr>
+      <w:bookmarkStart w:id="28" w:name="heading-8"/>
+      <w:r>
+        <w:t xml:space="preserve">Heading 8</w:t>
+      </w:r>
+      <w:bookmarkEnd w:id="28"/>
+    </w:p>
+    <w:p>
+      <w:pPr>
+        <w:pStyle w:val="Heading9"/>
+      </w:pPr>
+      <w:bookmarkStart w:id="29" w:name="heading-9"/>
+      <w:r>
+        <w:t xml:space="preserve">Heading 9</w:t>
+      </w:r>
+      <w:bookmarkEnd w:id="29"/>
+    </w:p>
+    <w:p>
+      <w:pPr>
+        <w:pStyle w:val="FirstParagraph"/>
+      </w:pPr>
+      <w:r>
+        <w:t xml:space="preserve">First Paragraph.</w:t>
+      </w:r>
+    </w:p>
+    <w:p>
+      <w:pPr>
         <w:pStyle w:val="BodyText"/>
       </w:pPr>
       <w:r>
-        <w:t>Reference document: styles for the TTAB template.</w:t>
+        <w:t xml:space="preserve">Body Text. Body Text Char.</w:t>
+      </w:r>
+      <w:r>
+        <w:t xml:space="preserve"> </w:t>
+      </w:r>
+      <w:r>
+        <w:rPr>
+          <w:rStyle w:val="VerbatimChar"/>
+        </w:rPr>
+        <w:t xml:space="preserve">Verbatim Char</w:t>
+      </w:r>
+      <w:r>
+        <w:t xml:space="preserve">.</w:t>
+      </w:r>
+      <w:r>
+        <w:t xml:space="preserve"> </w:t>
+      </w:r>
+      <w:hyperlink r:id="rId30">
+        <w:r>
+          <w:rPr>
+            <w:rStyle w:val="Hyperlink"/>
+          </w:rPr>
+          <w:t xml:space="preserve">Hyperlink</w:t>
+        </w:r>
+      </w:hyperlink>
+      <w:r>
+        <w:t xml:space="preserve">.</w:t>
+      </w:r>
+      <w:r>
+        <w:t xml:space="preserve"> </w:t>
+      </w:r>
+      <w:r>
+        <w:t xml:space="preserve">Footnote.</w:t>
+      </w:r>
+      <w:r>
+        <w:rPr>
+          <w:rStyle w:val="FootnoteReference"/>
+        </w:rPr>
+        <w:footnoteReference w:id="31"/>
+      </w:r>
+    </w:p>
+    <w:p>
+      <w:pPr>
+        <w:pStyle w:val="BlockText"/>
+      </w:pPr>
+      <w:r>
+        <w:t xml:space="preserve">Block Text.</w:t>
+      </w:r>
+    </w:p>
+    <w:p>
+      <w:pPr>
+        <w:pStyle w:val="TableCaption"/>
+      </w:pPr>
+      <w:r>
+        <w:t xml:space="preserve">Table caption.</w:t>
+      </w:r>
+    </w:p>
+    <w:tbl>
+      <w:tblPr>
+        <w:tblStyle w:val="Table"/>
+        <w:tblLook w:firstRow="1"/>
+        <w:tblCaption w:val="Table caption."/>
+      </w:tblPr>
+      <w:tblGrid/>
+      <w:tr>
+        <w:trPr>
+          <w:cnfStyle w:firstRow="1" w:val="100000000000"/>
+        </w:trPr>
+        <w:tc>
+          <w:tcPr>
+            <w:tcBorders>
+              <w:bottom w:val="single"/>
+            </w:tcBorders>
+            <w:vAlign w:val="bottom"/>
+          </w:tcPr>
+          <w:p>
+            <w:pPr>
+              <w:pStyle w:val="Compact"/>
+              <w:jc w:val="left"/>
+            </w:pPr>
+            <w:r>
+              <w:t xml:space="preserve">Table</w:t>
+            </w:r>
+          </w:p>
+        </w:tc>
+        <w:tc>
+          <w:tcPr>
+            <w:tcBorders>
+              <w:bottom w:val="single"/>
+            </w:tcBorders>
+            <w:vAlign w:val="bottom"/>
+          </w:tcPr>
+          <w:p>
+            <w:pPr>
+              <w:pStyle w:val="Compact"/>
+              <w:jc w:val="left"/>
+            </w:pPr>
+            <w:r>
+              <w:t xml:space="preserve">Table</w:t>
+            </w:r>
+          </w:p>
+        </w:tc>
+      </w:tr>
+      <w:tr>
+        <w:tc>
+          <w:p>
+            <w:pPr>
+              <w:pStyle w:val="Compact"/>
+              <w:jc w:val="left"/>
+            </w:pPr>
+            <w:r>
+              <w:t xml:space="preserve">1</w:t>
+            </w:r>
+          </w:p>
+        </w:tc>
+        <w:tc>
+          <w:p>
+            <w:pPr>
+              <w:pStyle w:val="Compact"/>
+              <w:jc w:val="left"/>
+            </w:pPr>
+            <w:r>
+              <w:t xml:space="preserve">2</w:t>
+            </w:r>
+          </w:p>
+        </w:tc>
+      </w:tr>
+    </w:tbl>
+    <w:p>
+      <w:pPr>
+        <w:pStyle w:val="ImageCaption"/>
+      </w:pPr>
+      <w:r>
+        <w:t xml:space="preserve">Image Caption</w:t>
+      </w:r>
+    </w:p>
+    <w:p>
+      <w:pPr>
+        <w:pStyle w:val="DefinitionTerm"/>
+      </w:pPr>
+      <w:r>
+        <w:t xml:space="preserve">DefinitionTerm</w:t>
+      </w:r>
+    </w:p>
+    <w:p>
+      <w:pPr>
+        <w:pStyle w:val="Definition"/>
+      </w:pPr>
+      <w:r>
+        <w:t xml:space="preserve">Definition</w:t>
+      </w:r>
+    </w:p>
+    <w:p>
+      <w:pPr>
+        <w:pStyle w:val="DefinitionTerm"/>
+      </w:pPr>
+      <w:r>
+        <w:t xml:space="preserve">DefinitionTerm</w:t>
+      </w:r>
+    </w:p>
+    <w:p>
+      <w:pPr>
+        <w:pStyle w:val="Definition"/>
+      </w:pPr>
+      <w:r>
+        <w:t xml:space="preserve">Definition</w:t>
       </w:r>
     </w:p>
     <w:sectPr>
       <w:footerReference w:type="default" r:id="rIdFooter1"/>
       <w:pgSz w:w="12240" w:h="15840"/>
-      <w:pgMar w:top="1440" w:right="1440" w:bottom="1440" w:left="1440" w:header="720" w:footer="720" w:gutter="0"/>
+      <w:pgMar w:top="1440" w:right="1440" w:bottom="1440" w:left="1440" w:header="720" w:footer="432" w:gutter="0"/>
     </w:sectPr>
   </w:body>
 </w:document>
@@ -210,12 +513,13 @@
         <w:rFonts w:ascii="Times New Roman" w:hAnsi="Times New Roman" w:eastAsia="Times New Roman" w:cs="Times New Roman"/>
         <w:sz w:val="24"/>
         <w:szCs w:val="24"/>
-        <w:lang w:val="en-US" w:eastAsia="en-US" w:bidi="ar-SA"/>
+        <w:lang w:val="en-US" w:eastAsia="zh-CN" w:bidi="ar-SA"/>
       </w:rPr>
     </w:rPrDefault>
     <w:pPrDefault>
       <w:pPr>
-        <w:spacing w:after="0" w:line="240" w:lineRule="auto"/>
+        <w:widowControl/>
+        <w:spacing w:after="0"/>
       </w:pPr>
     </w:pPrDefault>
   </w:docDefaults>
@@ -230,8 +534,7 @@
     <w:link w:val="BodyTextChar"/>
     <w:qFormat/>
     <w:pPr>
-      <w:widowControl/>
-      <w:spacing w:before="0" w:after="0" w:line="480" w:lineRule="auto"/>
+      <w:spacing w:before="0" w:after="0" w:line="552" w:lineRule="exact"/>
       <w:ind w:firstLine="720"/>
     </w:pPr>
   </w:style>
@@ -243,10 +546,10 @@
   </w:style>
   <w:style w:type="paragraph" w:customStyle="1" w:styleId="Compact">
     <w:name w:val="Compact"/>
-    <w:basedOn w:val="Normal"/>
-    <w:qFormat/>
-    <w:pPr>
-      <w:spacing w:before="0" w:after="120" w:line="240" w:lineRule="auto"/>
+    <w:basedOn w:val="BodyText"/>
+    <w:qFormat/>
+    <w:pPr>
+      <w:spacing w:before="36" w:after="36"/>
     </w:pPr>
   </w:style>
   <w:style w:type="paragraph" w:styleId="Title">
@@ -389,16 +692,21 @@
     <w:link w:val="Heading1Char"/>
     <w:uiPriority w:val="9"/>
     <w:qFormat/>
+    <w:rsid w:val="00A10FD9"/>
     <w:pPr>
       <w:keepNext/>
       <w:keepLines/>
-      <w:spacing w:before="360" w:after="240" w:line="240" w:lineRule="auto"/>
+      <w:spacing w:before="240" w:after="120" w:line="276" w:lineRule="exact"/>
+      <w:ind w:firstLine="0"/>
       <w:jc w:val="center"/>
       <w:outlineLvl w:val="0"/>
     </w:pPr>
     <w:rPr>
+      <w:rFonts w:ascii="Times New Roman" w:hAnsi="Times New Roman" w:eastAsia="Times New Roman" w:cs="Times New Roman"/>
       <w:b/>
       <w:bCs/>
+      <w:caps/>
+      <w:color w:val="000000"/>
       <w:sz w:val="24"/>
       <w:szCs w:val="24"/>
     </w:rPr>
@@ -407,18 +715,24 @@
     <w:name w:val="heading 2"/>
     <w:basedOn w:val="Normal"/>
     <w:next w:val="BodyText"/>
-    <w:uiPriority w:val="9"/>
+    <w:link w:val="Heading2Char"/>
+    <w:uiPriority w:val="9"/>
+    <w:semiHidden/>
     <w:unhideWhenUsed/>
     <w:qFormat/>
+    <w:rsid w:val="00A10FD9"/>
     <w:pPr>
       <w:keepNext/>
       <w:keepLines/>
-      <w:spacing w:before="300" w:after="200" w:line="240" w:lineRule="auto"/>
+      <w:spacing w:before="240" w:after="120" w:line="276" w:lineRule="exact"/>
+      <w:ind w:firstLine="0"/>
       <w:outlineLvl w:val="1"/>
     </w:pPr>
     <w:rPr>
+      <w:rFonts w:ascii="Times New Roman" w:hAnsi="Times New Roman" w:eastAsia="Times New Roman" w:cs="Times New Roman"/>
       <w:b/>
       <w:bCs/>
+      <w:color w:val="000000"/>
       <w:sz w:val="24"/>
       <w:szCs w:val="24"/>
     </w:rPr>
@@ -427,29 +741,60 @@
     <w:name w:val="heading 3"/>
     <w:basedOn w:val="Normal"/>
     <w:next w:val="BodyText"/>
-    <w:uiPriority w:val="9"/>
+    <w:link w:val="Heading3Char"/>
+    <w:uiPriority w:val="9"/>
+    <w:semiHidden/>
     <w:unhideWhenUsed/>
     <w:qFormat/>
+    <w:rsid w:val="00A10FD9"/>
     <w:pPr>
       <w:keepNext/>
       <w:keepLines/>
-      <w:spacing w:before="240" w:after="180" w:line="240" w:lineRule="auto"/>
+      <w:spacing w:before="240" w:after="120" w:line="276" w:lineRule="exact"/>
+      <w:ind w:firstLine="0"/>
       <w:outlineLvl w:val="2"/>
     </w:pPr>
     <w:rPr>
+      <w:rFonts w:ascii="Times New Roman" w:hAnsi="Times New Roman" w:eastAsia="Times New Roman" w:cs="Times New Roman"/>
+      <w:b/>
+      <w:bCs/>
+      <w:color w:val="000000"/>
+      <w:sz w:val="24"/>
+      <w:szCs w:val="24"/>
+    </w:rPr>
+  </w:style>
+  <w:style w:type="paragraph" w:styleId="Heading4">
+    <w:name w:val="heading 4"/>
+    <w:basedOn w:val="Normal"/>
+    <w:next w:val="BodyText"/>
+    <w:link w:val="Heading4Char"/>
+    <w:uiPriority w:val="9"/>
+    <w:semiHidden/>
+    <w:unhideWhenUsed/>
+    <w:qFormat/>
+    <w:rsid w:val="00A10FD9"/>
+    <w:pPr>
+      <w:keepNext/>
+      <w:keepLines/>
+      <w:spacing w:before="240" w:after="120" w:line="276" w:lineRule="exact"/>
+      <w:ind w:firstLine="0"/>
+      <w:outlineLvl w:val="3"/>
+    </w:pPr>
+    <w:rPr>
+      <w:rFonts w:ascii="Times New Roman" w:hAnsi="Times New Roman" w:eastAsia="Times New Roman" w:cs="Times New Roman"/>
       <w:b/>
       <w:bCs/>
       <w:i/>
-      <w:iCs/>
+      <w:color w:val="000000"/>
       <w:sz w:val="24"/>
       <w:szCs w:val="24"/>
     </w:rPr>
   </w:style>
-  <w:style w:type="paragraph" w:styleId="Heading4">
-    <w:name w:val="heading 4"/>
-    <w:basedOn w:val="Normal"/>
-    <w:next w:val="BodyText"/>
-    <w:link w:val="Heading4Char"/>
+  <w:style w:type="paragraph" w:styleId="Heading5">
+    <w:name w:val="heading 5"/>
+    <w:basedOn w:val="Normal"/>
+    <w:next w:val="BodyText"/>
+    <w:link w:val="Heading5Char"/>
     <w:uiPriority w:val="9"/>
     <w:semiHidden/>
     <w:unhideWhenUsed/>
@@ -458,9 +803,156 @@
     <w:pPr>
       <w:keepNext/>
       <w:keepLines/>
-      <w:spacing w:before="80" w:after="40"/>
-      <w:outlineLvl w:val="3"/>
-    </w:pPr>
+      <w:spacing w:before="240" w:after="120" w:line="276" w:lineRule="exact"/>
+      <w:ind w:firstLine="0"/>
+      <w:outlineLvl w:val="4"/>
+    </w:pPr>
+    <w:rPr>
+      <w:rFonts w:ascii="Times New Roman" w:hAnsi="Times New Roman" w:eastAsia="Times New Roman" w:cs="Times New Roman"/>
+      <w:b/>
+      <w:bCs/>
+      <w:i/>
+      <w:color w:val="000000"/>
+      <w:sz w:val="24"/>
+      <w:szCs w:val="24"/>
+    </w:rPr>
+  </w:style>
+  <w:style w:type="paragraph" w:styleId="Heading6">
+    <w:name w:val="heading 6"/>
+    <w:basedOn w:val="Normal"/>
+    <w:next w:val="BodyText"/>
+    <w:link w:val="Heading6Char"/>
+    <w:uiPriority w:val="9"/>
+    <w:semiHidden/>
+    <w:unhideWhenUsed/>
+    <w:qFormat/>
+    <w:rsid w:val="00A10FD9"/>
+    <w:pPr>
+      <w:keepNext/>
+      <w:keepLines/>
+      <w:spacing w:before="40" w:after="0"/>
+      <w:outlineLvl w:val="5"/>
+    </w:pPr>
+    <w:rPr>
+      <w:rFonts w:eastAsiaTheme="majorEastAsia" w:cstheme="majorBidi"/>
+      <w:i/>
+      <w:iCs/>
+      <w:color w:val="595959" w:themeColor="text1" w:themeTint="A6"/>
+    </w:rPr>
+  </w:style>
+  <w:style w:type="paragraph" w:styleId="Heading7">
+    <w:name w:val="heading 7"/>
+    <w:basedOn w:val="Normal"/>
+    <w:next w:val="BodyText"/>
+    <w:link w:val="Heading7Char"/>
+    <w:uiPriority w:val="9"/>
+    <w:semiHidden/>
+    <w:unhideWhenUsed/>
+    <w:qFormat/>
+    <w:rsid w:val="00A10FD9"/>
+    <w:pPr>
+      <w:keepNext/>
+      <w:keepLines/>
+      <w:spacing w:before="40" w:after="0"/>
+      <w:outlineLvl w:val="6"/>
+    </w:pPr>
+    <w:rPr>
+      <w:rFonts w:eastAsiaTheme="majorEastAsia" w:cstheme="majorBidi"/>
+      <w:color w:val="595959" w:themeColor="text1" w:themeTint="A6"/>
+    </w:rPr>
+  </w:style>
+  <w:style w:type="paragraph" w:styleId="Heading8">
+    <w:name w:val="heading 8"/>
+    <w:basedOn w:val="Normal"/>
+    <w:next w:val="BodyText"/>
+    <w:link w:val="Heading8Char"/>
+    <w:uiPriority w:val="9"/>
+    <w:semiHidden/>
+    <w:unhideWhenUsed/>
+    <w:qFormat/>
+    <w:rsid w:val="00A10FD9"/>
+    <w:pPr>
+      <w:keepNext/>
+      <w:keepLines/>
+      <w:spacing w:after="0"/>
+      <w:outlineLvl w:val="7"/>
+    </w:pPr>
+    <w:rPr>
+      <w:rFonts w:eastAsiaTheme="majorEastAsia" w:cstheme="majorBidi"/>
+      <w:i/>
+      <w:iCs/>
+      <w:color w:val="272727" w:themeColor="text1" w:themeTint="D8"/>
+    </w:rPr>
+  </w:style>
+  <w:style w:type="paragraph" w:styleId="Heading9">
+    <w:name w:val="heading 9"/>
+    <w:basedOn w:val="Normal"/>
+    <w:next w:val="BodyText"/>
+    <w:link w:val="Heading9Char"/>
+    <w:uiPriority w:val="9"/>
+    <w:semiHidden/>
+    <w:unhideWhenUsed/>
+    <w:qFormat/>
+    <w:rsid w:val="00A10FD9"/>
+    <w:pPr>
+      <w:keepNext/>
+      <w:keepLines/>
+      <w:spacing w:after="0"/>
+      <w:outlineLvl w:val="8"/>
+    </w:pPr>
+    <w:rPr>
+      <w:rFonts w:eastAsiaTheme="majorEastAsia" w:cstheme="majorBidi"/>
+      <w:color w:val="272727" w:themeColor="text1" w:themeTint="D8"/>
+    </w:rPr>
+  </w:style>
+  <w:style w:type="character" w:customStyle="1" w:styleId="Heading1Char">
+    <w:name w:val="Heading 1 Char"/>
+    <w:basedOn w:val="DefaultParagraphFont"/>
+    <w:link w:val="Heading1"/>
+    <w:uiPriority w:val="9"/>
+    <w:rsid w:val="00A10FD9"/>
+    <w:rPr>
+      <w:rFonts w:asciiTheme="majorHAnsi" w:eastAsiaTheme="majorEastAsia" w:hAnsiTheme="majorHAnsi" w:cstheme="majorBidi"/>
+      <w:color w:val="0F4761" w:themeColor="accent1" w:themeShade="BF"/>
+      <w:sz w:val="40"/>
+      <w:szCs w:val="40"/>
+    </w:rPr>
+  </w:style>
+  <w:style w:type="character" w:customStyle="1" w:styleId="Heading2Char">
+    <w:name w:val="Heading 2 Char"/>
+    <w:basedOn w:val="DefaultParagraphFont"/>
+    <w:link w:val="Heading2"/>
+    <w:uiPriority w:val="9"/>
+    <w:semiHidden/>
+    <w:rsid w:val="00A10FD9"/>
+    <w:rPr>
+      <w:rFonts w:asciiTheme="majorHAnsi" w:eastAsiaTheme="majorEastAsia" w:hAnsiTheme="majorHAnsi" w:cstheme="majorBidi"/>
+      <w:color w:val="0F4761" w:themeColor="accent1" w:themeShade="BF"/>
+      <w:sz w:val="32"/>
+      <w:szCs w:val="32"/>
+    </w:rPr>
+  </w:style>
+  <w:style w:type="character" w:customStyle="1" w:styleId="Heading3Char">
+    <w:name w:val="Heading 3 Char"/>
+    <w:basedOn w:val="DefaultParagraphFont"/>
+    <w:link w:val="Heading3"/>
+    <w:uiPriority w:val="9"/>
+    <w:semiHidden/>
+    <w:rsid w:val="00A10FD9"/>
+    <w:rPr>
+      <w:rFonts w:eastAsiaTheme="majorEastAsia" w:cstheme="majorBidi"/>
+      <w:color w:val="0F4761" w:themeColor="accent1" w:themeShade="BF"/>
+      <w:sz w:val="28"/>
+      <w:szCs w:val="28"/>
+    </w:rPr>
+  </w:style>
+  <w:style w:type="character" w:customStyle="1" w:styleId="Heading4Char">
+    <w:name w:val="Heading 4 Char"/>
+    <w:basedOn w:val="DefaultParagraphFont"/>
+    <w:link w:val="Heading4"/>
+    <w:uiPriority w:val="9"/>
+    <w:semiHidden/>
+    <w:rsid w:val="00A10FD9"/>
     <w:rPr>
       <w:rFonts w:eastAsiaTheme="majorEastAsia" w:cstheme="majorBidi"/>
       <w:i/>
@@ -468,43 +960,25 @@
       <w:color w:val="0F4761" w:themeColor="accent1" w:themeShade="BF"/>
     </w:rPr>
   </w:style>
-  <w:style w:type="paragraph" w:styleId="Heading5">
-    <w:name w:val="heading 5"/>
-    <w:basedOn w:val="Normal"/>
-    <w:next w:val="BodyText"/>
-    <w:link w:val="Heading5Char"/>
-    <w:uiPriority w:val="9"/>
-    <w:semiHidden/>
-    <w:unhideWhenUsed/>
-    <w:qFormat/>
-    <w:rsid w:val="00A10FD9"/>
-    <w:pPr>
-      <w:keepNext/>
-      <w:keepLines/>
-      <w:spacing w:before="80" w:after="40"/>
-      <w:outlineLvl w:val="4"/>
-    </w:pPr>
+  <w:style w:type="character" w:customStyle="1" w:styleId="Heading5Char">
+    <w:name w:val="Heading 5 Char"/>
+    <w:basedOn w:val="DefaultParagraphFont"/>
+    <w:link w:val="Heading5"/>
+    <w:uiPriority w:val="9"/>
+    <w:semiHidden/>
+    <w:rsid w:val="00A10FD9"/>
     <w:rPr>
       <w:rFonts w:eastAsiaTheme="majorEastAsia" w:cstheme="majorBidi"/>
       <w:color w:val="0F4761" w:themeColor="accent1" w:themeShade="BF"/>
     </w:rPr>
   </w:style>
-  <w:style w:type="paragraph" w:styleId="Heading6">
-    <w:name w:val="heading 6"/>
-    <w:basedOn w:val="Normal"/>
-    <w:next w:val="BodyText"/>
-    <w:link w:val="Heading6Char"/>
-    <w:uiPriority w:val="9"/>
-    <w:semiHidden/>
-    <w:unhideWhenUsed/>
-    <w:qFormat/>
-    <w:rsid w:val="00A10FD9"/>
-    <w:pPr>
-      <w:keepNext/>
-      <w:keepLines/>
-      <w:spacing w:before="40" w:after="0"/>
-      <w:outlineLvl w:val="5"/>
-    </w:pPr>
+  <w:style w:type="character" w:customStyle="1" w:styleId="Heading6Char">
+    <w:name w:val="Heading 6 Char"/>
+    <w:basedOn w:val="DefaultParagraphFont"/>
+    <w:link w:val="Heading6"/>
+    <w:uiPriority w:val="9"/>
+    <w:semiHidden/>
+    <w:rsid w:val="00A10FD9"/>
     <w:rPr>
       <w:rFonts w:eastAsiaTheme="majorEastAsia" w:cstheme="majorBidi"/>
       <w:i/>
@@ -512,43 +986,25 @@
       <w:color w:val="595959" w:themeColor="text1" w:themeTint="A6"/>
     </w:rPr>
   </w:style>
-  <w:style w:type="paragraph" w:styleId="Heading7">
-    <w:name w:val="heading 7"/>
-    <w:basedOn w:val="Normal"/>
-    <w:next w:val="BodyText"/>
-    <w:link w:val="Heading7Char"/>
-    <w:uiPriority w:val="9"/>
-    <w:semiHidden/>
-    <w:unhideWhenUsed/>
-    <w:qFormat/>
-    <w:rsid w:val="00A10FD9"/>
-    <w:pPr>
-      <w:keepNext/>
-      <w:keepLines/>
-      <w:spacing w:before="40" w:after="0"/>
-      <w:outlineLvl w:val="6"/>
-    </w:pPr>
+  <w:style w:type="character" w:customStyle="1" w:styleId="Heading7Char">
+    <w:name w:val="Heading 7 Char"/>
+    <w:basedOn w:val="DefaultParagraphFont"/>
+    <w:link w:val="Heading7"/>
+    <w:uiPriority w:val="9"/>
+    <w:semiHidden/>
+    <w:rsid w:val="00A10FD9"/>
     <w:rPr>
       <w:rFonts w:eastAsiaTheme="majorEastAsia" w:cstheme="majorBidi"/>
       <w:color w:val="595959" w:themeColor="text1" w:themeTint="A6"/>
     </w:rPr>
   </w:style>
-  <w:style w:type="paragraph" w:styleId="Heading8">
-    <w:name w:val="heading 8"/>
-    <w:basedOn w:val="Normal"/>
-    <w:next w:val="BodyText"/>
-    <w:link w:val="Heading8Char"/>
-    <w:uiPriority w:val="9"/>
-    <w:semiHidden/>
-    <w:unhideWhenUsed/>
-    <w:qFormat/>
-    <w:rsid w:val="00A10FD9"/>
-    <w:pPr>
-      <w:keepNext/>
-      <w:keepLines/>
-      <w:spacing w:after="0"/>
-      <w:outlineLvl w:val="7"/>
-    </w:pPr>
+  <w:style w:type="character" w:customStyle="1" w:styleId="Heading8Char">
+    <w:name w:val="Heading 8 Char"/>
+    <w:basedOn w:val="DefaultParagraphFont"/>
+    <w:link w:val="Heading8"/>
+    <w:uiPriority w:val="9"/>
+    <w:semiHidden/>
+    <w:rsid w:val="00A10FD9"/>
     <w:rPr>
       <w:rFonts w:eastAsiaTheme="majorEastAsia" w:cstheme="majorBidi"/>
       <w:i/>
@@ -556,134 +1012,6 @@
       <w:color w:val="272727" w:themeColor="text1" w:themeTint="D8"/>
     </w:rPr>
   </w:style>
-  <w:style w:type="paragraph" w:styleId="Heading9">
-    <w:name w:val="heading 9"/>
-    <w:basedOn w:val="Normal"/>
-    <w:next w:val="BodyText"/>
-    <w:link w:val="Heading9Char"/>
-    <w:uiPriority w:val="9"/>
-    <w:semiHidden/>
-    <w:unhideWhenUsed/>
-    <w:qFormat/>
-    <w:rsid w:val="00A10FD9"/>
-    <w:pPr>
-      <w:keepNext/>
-      <w:keepLines/>
-      <w:spacing w:after="0"/>
-      <w:outlineLvl w:val="8"/>
-    </w:pPr>
-    <w:rPr>
-      <w:rFonts w:eastAsiaTheme="majorEastAsia" w:cstheme="majorBidi"/>
-      <w:color w:val="272727" w:themeColor="text1" w:themeTint="D8"/>
-    </w:rPr>
-  </w:style>
-  <w:style w:type="character" w:customStyle="1" w:styleId="Heading1Char">
-    <w:name w:val="Heading 1 Char"/>
-    <w:basedOn w:val="DefaultParagraphFont"/>
-    <w:link w:val="Heading1"/>
-    <w:uiPriority w:val="9"/>
-    <w:rsid w:val="00A10FD9"/>
-    <w:rPr>
-      <w:rFonts w:asciiTheme="majorHAnsi" w:eastAsiaTheme="majorEastAsia" w:hAnsiTheme="majorHAnsi" w:cstheme="majorBidi"/>
-      <w:color w:val="0F4761" w:themeColor="accent1" w:themeShade="BF"/>
-      <w:sz w:val="40"/>
-      <w:szCs w:val="40"/>
-    </w:rPr>
-  </w:style>
-  <w:style w:type="character" w:customStyle="1" w:styleId="Heading2Char">
-    <w:name w:val="Heading 2 Char"/>
-    <w:basedOn w:val="DefaultParagraphFont"/>
-    <w:link w:val="Heading2"/>
-    <w:uiPriority w:val="9"/>
-    <w:semiHidden/>
-    <w:rsid w:val="00A10FD9"/>
-    <w:rPr>
-      <w:rFonts w:asciiTheme="majorHAnsi" w:eastAsiaTheme="majorEastAsia" w:hAnsiTheme="majorHAnsi" w:cstheme="majorBidi"/>
-      <w:color w:val="0F4761" w:themeColor="accent1" w:themeShade="BF"/>
-      <w:sz w:val="32"/>
-      <w:szCs w:val="32"/>
-    </w:rPr>
-  </w:style>
-  <w:style w:type="character" w:customStyle="1" w:styleId="Heading3Char">
-    <w:name w:val="Heading 3 Char"/>
-    <w:basedOn w:val="DefaultParagraphFont"/>
-    <w:link w:val="Heading3"/>
-    <w:uiPriority w:val="9"/>
-    <w:semiHidden/>
-    <w:rsid w:val="00A10FD9"/>
-    <w:rPr>
-      <w:rFonts w:eastAsiaTheme="majorEastAsia" w:cstheme="majorBidi"/>
-      <w:color w:val="0F4761" w:themeColor="accent1" w:themeShade="BF"/>
-      <w:sz w:val="28"/>
-      <w:szCs w:val="28"/>
-    </w:rPr>
-  </w:style>
-  <w:style w:type="character" w:customStyle="1" w:styleId="Heading4Char">
-    <w:name w:val="Heading 4 Char"/>
-    <w:basedOn w:val="DefaultParagraphFont"/>
-    <w:link w:val="Heading4"/>
-    <w:uiPriority w:val="9"/>
-    <w:semiHidden/>
-    <w:rsid w:val="00A10FD9"/>
-    <w:rPr>
-      <w:rFonts w:eastAsiaTheme="majorEastAsia" w:cstheme="majorBidi"/>
-      <w:i/>
-      <w:iCs/>
-      <w:color w:val="0F4761" w:themeColor="accent1" w:themeShade="BF"/>
-    </w:rPr>
-  </w:style>
-  <w:style w:type="character" w:customStyle="1" w:styleId="Heading5Char">
-    <w:name w:val="Heading 5 Char"/>
-    <w:basedOn w:val="DefaultParagraphFont"/>
-    <w:link w:val="Heading5"/>
-    <w:uiPriority w:val="9"/>
-    <w:semiHidden/>
-    <w:rsid w:val="00A10FD9"/>
-    <w:rPr>
-      <w:rFonts w:eastAsiaTheme="majorEastAsia" w:cstheme="majorBidi"/>
-      <w:color w:val="0F4761" w:themeColor="accent1" w:themeShade="BF"/>
-    </w:rPr>
-  </w:style>
-  <w:style w:type="character" w:customStyle="1" w:styleId="Heading6Char">
-    <w:name w:val="Heading 6 Char"/>
-    <w:basedOn w:val="DefaultParagraphFont"/>
-    <w:link w:val="Heading6"/>
-    <w:uiPriority w:val="9"/>
-    <w:semiHidden/>
-    <w:rsid w:val="00A10FD9"/>
-    <w:rPr>
-      <w:rFonts w:eastAsiaTheme="majorEastAsia" w:cstheme="majorBidi"/>
-      <w:i/>
-      <w:iCs/>
-      <w:color w:val="595959" w:themeColor="text1" w:themeTint="A6"/>
-    </w:rPr>
-  </w:style>
-  <w:style w:type="character" w:customStyle="1" w:styleId="Heading7Char">
-    <w:name w:val="Heading 7 Char"/>
-    <w:basedOn w:val="DefaultParagraphFont"/>
-    <w:link w:val="Heading7"/>
-    <w:uiPriority w:val="9"/>
-    <w:semiHidden/>
-    <w:rsid w:val="00A10FD9"/>
-    <w:rPr>
-      <w:rFonts w:eastAsiaTheme="majorEastAsia" w:cstheme="majorBidi"/>
-      <w:color w:val="595959" w:themeColor="text1" w:themeTint="A6"/>
-    </w:rPr>
-  </w:style>
-  <w:style w:type="character" w:customStyle="1" w:styleId="Heading8Char">
-    <w:name w:val="Heading 8 Char"/>
-    <w:basedOn w:val="DefaultParagraphFont"/>
-    <w:link w:val="Heading8"/>
-    <w:uiPriority w:val="9"/>
-    <w:semiHidden/>
-    <w:rsid w:val="00A10FD9"/>
-    <w:rPr>
-      <w:rFonts w:eastAsiaTheme="majorEastAsia" w:cstheme="majorBidi"/>
-      <w:i/>
-      <w:iCs/>
-      <w:color w:val="272727" w:themeColor="text1" w:themeTint="D8"/>
-    </w:rPr>
-  </w:style>
   <w:style w:type="character" w:customStyle="1" w:styleId="Heading9Char">
     <w:name w:val="Heading 9 Char"/>
     <w:basedOn w:val="DefaultParagraphFont"/>
@@ -696,16 +1024,25 @@
       <w:color w:val="272727" w:themeColor="text1" w:themeTint="D8"/>
     </w:rPr>
   </w:style>
+  <w:style w:type="paragraph" w:customStyle="1" w:styleId="ListItem">
+    <w:name w:val="List Item"/>
+    <w:basedOn w:val="BodyText"/>
+    <w:qFormat/>
+    <w:pPr>
+      <w:spacing w:before="0" w:after="0" w:line="552" w:lineRule="exact"/>
+      <w:ind w:left="720" w:hanging="720"/>
+    </w:pPr>
+  </w:style>
   <w:style w:type="paragraph" w:styleId="BlockText">
     <w:name w:val="Block Text"/>
-    <w:basedOn w:val="Normal"/>
+    <w:basedOn w:val="BodyText"/>
     <w:next w:val="BodyText"/>
     <w:uiPriority w:val="9"/>
     <w:unhideWhenUsed/>
     <w:qFormat/>
     <w:pPr>
-      <w:spacing w:before="200" w:after="220" w:line="240" w:lineRule="auto"/>
-      <w:ind w:left="1440" w:right="1440" w:firstLine="0"/>
+      <w:spacing w:before="280" w:after="280" w:line="276" w:lineRule="exact"/>
+      <w:ind w:firstLine="0" w:left="720" w:right="720"/>
     </w:pPr>
   </w:style>
   <w:style w:type="paragraph" w:styleId="FootnoteText">
@@ -716,7 +1053,8 @@
     <w:unhideWhenUsed/>
     <w:qFormat/>
     <w:pPr>
-      <w:spacing w:after="60" w:line="240" w:lineRule="auto"/>
+      <w:keepLines/>
+      <w:spacing w:before="0" w:after="140" w:line="276" w:lineRule="exact"/>
     </w:pPr>
     <w:rPr>
       <w:sz w:val="24"/>
@@ -731,8 +1069,8 @@
     <w:unhideWhenUsed/>
     <w:qFormat/>
     <w:pPr>
-      <w:spacing w:before="100" w:after="100"/>
-      <w:ind w:firstLine="0" w:left="480" w:right="480"/>
+      <w:spacing w:before="280" w:after="280"/>
+      <w:ind w:firstLine="0" w:left="720" w:right="720"/>
     </w:pPr>
   </w:style>
   <w:style w:type="character" w:default="1" w:styleId="DefaultParagraphFont">
@@ -743,8 +1081,6 @@
   <w:style w:type="table" w:default="1" w:styleId="Table">
     <w:name w:val="Table"/>
     <w:basedOn w:val="TableNormal"/>
-    <w:semiHidden/>
-    <w:unhideWhenUsed/>
     <w:qFormat/>
     <w:tblPr>
       <w:tblInd w:w="0" w:type="dxa"/>
@@ -756,13 +1092,6 @@
       </w:tblCellMar>
     </w:tblPr>
     <w:tblStylePr w:type="firstRow">
-      <w:tblPr>
-        <w:jc w:val="left"/>
-        <w:tblInd w:w="0" w:type="dxa"/>
-      </w:tblPr>
-      <w:trPr>
-        <w:jc w:val="left"/>
-      </w:trPr>
       <w:tcPr>
         <w:tcBorders>
           <w:bottom w:val="single"/>
@@ -849,7 +1178,7 @@
     <w:name w:val="Hyperlink"/>
     <w:basedOn w:val="BodyTextChar"/>
     <w:rPr>
-      <w:color w:val="4F81BD" w:themeColor="accent1"/>
+      <w:color w:val="000000"/>
     </w:rPr>
   </w:style>
   <w:style w:type="paragraph" w:styleId="TOCHeading">
@@ -869,78 +1198,6 @@
       <w:bCs w:val="0"/>
       <w:color w:val="365F91" w:themeColor="accent1" w:themeShade="BF"/>
     </w:rPr>
-  </w:style>
-  <w:style w:type="paragraph" w:customStyle="1" w:styleId="DraftingNote">
-    <w:name w:val="Drafting Note"/>
-    <w:basedOn w:val="Normal"/>
-    <w:next w:val="BodyText"/>
-    <w:qFormat/>
-    <w:pPr>
-      <w:keepNext/>
-      <w:spacing w:before="180" w:after="180" w:line="240" w:lineRule="auto"/>
-    </w:pPr>
-    <w:rPr>
-      <w:i/>
-      <w:iCs/>
-    </w:rPr>
-  </w:style>
-  <w:style w:type="paragraph" w:customStyle="1" w:styleId="CaptionCenter">
-    <w:name w:val="Caption Center"/>
-    <w:basedOn w:val="Normal"/>
-    <w:qFormat/>
-    <w:pPr>
-      <w:spacing w:before="0" w:after="0" w:line="240" w:lineRule="auto"/>
-      <w:jc w:val="center"/>
-    </w:pPr>
-    <w:rPr>
-      <w:b/>
-      <w:bCs/>
-    </w:rPr>
-  </w:style>
-  <w:style w:type="paragraph" w:customStyle="1" w:styleId="CaptionLine">
-    <w:name w:val="Caption Line"/>
-    <w:basedOn w:val="Normal"/>
-    <w:qFormat/>
-    <w:pPr>
-      <w:spacing w:before="0" w:after="60" w:line="240" w:lineRule="auto"/>
-    </w:pPr>
-  </w:style>
-  <w:style w:type="paragraph" w:customStyle="1" w:styleId="PaperTitle">
-    <w:name w:val="Paper Title"/>
-    <w:basedOn w:val="Normal"/>
-    <w:next w:val="BodyText"/>
-    <w:qFormat/>
-    <w:pPr>
-      <w:keepNext/>
-      <w:spacing w:before="280" w:after="240" w:line="240" w:lineRule="auto"/>
-      <w:jc w:val="center"/>
-    </w:pPr>
-    <w:rPr>
-      <w:b/>
-      <w:bCs/>
-      <w:u w:val="single"/>
-    </w:rPr>
-  </w:style>
-  <w:style w:type="paragraph" w:customStyle="1" w:styleId="BodyTextKeep">
-    <w:name w:val="Body Text Keep"/>
-    <w:basedOn w:val="BodyText"/>
-    <w:next w:val="BodyText"/>
-    <w:qFormat/>
-    <w:pPr>
-      <w:keepNext/>
-      <w:keepLines/>
-    </w:pPr>
-  </w:style>
-  <w:style w:type="paragraph" w:customStyle="1" w:styleId="SignatureBlock">
-    <w:name w:val="Signature Block"/>
-    <w:basedOn w:val="Normal"/>
-    <w:qFormat/>
-    <w:pPr>
-      <w:keepNext/>
-      <w:keepLines/>
-      <w:spacing w:before="0" w:after="60" w:line="240" w:lineRule="auto"/>
-      <w:ind w:left="4680"/>
-    </w:pPr>
   </w:style>
 </w:styles>
 </file>

</xml_diff>